<commit_message>
BLA-004 – Implement Ride Preferences Form
</commit_message>
<xml_diff>
--- a/W3-BlaBla-Project-Part1/W3 - PRACTICE -  Generic & Screen Widgets.docx
+++ b/W3-BlaBla-Project-Part1/W3 - PRACTICE -  Generic & Screen Widgets.docx
@@ -7455,9 +7455,9 @@
       </w:tblPr>
       <w:tblGrid>
         <w:gridCol w:w="1980"/>
-        <w:gridCol w:w="3543"/>
-        <w:gridCol w:w="1842"/>
-        <w:gridCol w:w="1984"/>
+        <w:gridCol w:w="2434"/>
+        <w:gridCol w:w="3236"/>
+        <w:gridCol w:w="1699"/>
       </w:tblGrid>
       <w:tr>
         <w:trPr/>
@@ -7485,7 +7485,7 @@
         </w:tc>
         <w:tc>
           <w:tcPr>
-            <w:tcW w:w="3543" w:type="dxa"/>
+            <w:tcW w:w="2434" w:type="dxa"/>
             <w:tcBorders/>
             <w:shd w:color="auto" w:fill="B8CCE4" w:themeFill="accent1" w:themeFillTint="66" w:val="clear"/>
           </w:tcPr>
@@ -7507,7 +7507,7 @@
         </w:tc>
         <w:tc>
           <w:tcPr>
-            <w:tcW w:w="1842" w:type="dxa"/>
+            <w:tcW w:w="3236" w:type="dxa"/>
             <w:tcBorders/>
             <w:shd w:color="auto" w:fill="B8CCE4" w:themeFill="accent1" w:themeFillTint="66" w:val="clear"/>
           </w:tcPr>
@@ -7529,7 +7529,7 @@
         </w:tc>
         <w:tc>
           <w:tcPr>
-            <w:tcW w:w="1984" w:type="dxa"/>
+            <w:tcW w:w="1699" w:type="dxa"/>
             <w:tcBorders/>
             <w:shd w:color="auto" w:fill="B8CCE4" w:themeFill="accent1" w:themeFillTint="66" w:val="clear"/>
           </w:tcPr>
@@ -7562,13 +7562,15 @@
               <w:pStyle w:val="Normal"/>
               <w:spacing w:lineRule="auto" w:line="240"/>
               <w:rPr>
-                <w:rFonts w:ascii="Calibri" w:hAnsi="Calibri" w:cs="Calibri" w:asciiTheme="majorAscii" w:cstheme="majorAscii" w:hAnsiTheme="majorAscii"/>
-                <w:lang w:val="en-US"/>
+                <w:sz w:val="22"/>
+                <w:szCs w:val="22"/>
               </w:rPr>
             </w:pPr>
             <w:r>
               <w:rPr>
                 <w:rFonts w:cs="Calibri" w:ascii="Calibri" w:hAnsi="Calibri" w:asciiTheme="majorAscii" w:cstheme="majorAscii" w:hAnsiTheme="majorAscii"/>
+                <w:sz w:val="22"/>
+                <w:szCs w:val="22"/>
                 <w:lang w:val="en-US"/>
               </w:rPr>
               <w:t>BlaButton</w:t>
@@ -7577,7 +7579,7 @@
         </w:tc>
         <w:tc>
           <w:tcPr>
-            <w:tcW w:w="3543" w:type="dxa"/>
+            <w:tcW w:w="2434" w:type="dxa"/>
             <w:tcBorders/>
           </w:tcPr>
           <w:p>
@@ -7585,14 +7587,16 @@
               <w:pStyle w:val="Normal"/>
               <w:spacing w:lineRule="auto" w:line="240"/>
               <w:rPr>
-                <w:rFonts w:ascii="Calibri" w:hAnsi="Calibri" w:cs="Calibri" w:asciiTheme="majorHAnsi" w:cstheme="majorHAnsi" w:hAnsiTheme="majorHAnsi"/>
-                <w:color w:val="FF0000"/>
+                <w:sz w:val="22"/>
+                <w:szCs w:val="22"/>
               </w:rPr>
             </w:pPr>
             <w:r>
               <w:rPr>
                 <w:rFonts w:cs="Calibri" w:ascii="Calibri" w:hAnsi="Calibri" w:asciiTheme="majorHAnsi" w:cstheme="majorHAnsi" w:hAnsiTheme="majorHAnsi"/>
                 <w:color w:val="FF0000"/>
+                <w:sz w:val="22"/>
+                <w:szCs w:val="22"/>
               </w:rPr>
               <w:t xml:space="preserve"> </w:t>
             </w:r>
@@ -7603,12 +7607,17 @@
               <w:spacing w:lineRule="auto" w:line="240"/>
               <w:rPr>
                 <w:rFonts w:ascii="Calibri" w:hAnsi="Calibri" w:cs="Calibri" w:asciiTheme="majorHAnsi" w:cstheme="majorHAnsi" w:hAnsiTheme="majorHAnsi"/>
+                <w:sz w:val="22"/>
+                <w:szCs w:val="22"/>
               </w:rPr>
             </w:pPr>
             <w:r>
               <w:rPr>
                 <w:rFonts w:cs="Calibri" w:cstheme="majorHAnsi" w:ascii="Calibri" w:hAnsi="Calibri"/>
-              </w:rPr>
+                <w:sz w:val="22"/>
+                <w:szCs w:val="22"/>
+              </w:rPr>
+              <w:t>App Widget</w:t>
             </w:r>
           </w:p>
           <w:p>
@@ -7617,11 +7626,15 @@
               <w:spacing w:lineRule="auto" w:line="240"/>
               <w:rPr>
                 <w:rFonts w:ascii="Calibri" w:hAnsi="Calibri" w:cs="Calibri" w:asciiTheme="majorHAnsi" w:cstheme="majorHAnsi" w:hAnsiTheme="majorHAnsi"/>
+                <w:sz w:val="22"/>
+                <w:szCs w:val="22"/>
               </w:rPr>
             </w:pPr>
             <w:r>
               <w:rPr>
                 <w:rFonts w:cs="Calibri" w:cstheme="majorHAnsi" w:ascii="Calibri" w:hAnsi="Calibri"/>
+                <w:sz w:val="22"/>
+                <w:szCs w:val="22"/>
               </w:rPr>
             </w:r>
           </w:p>
@@ -7631,18 +7644,22 @@
               <w:spacing w:lineRule="auto" w:line="240"/>
               <w:rPr>
                 <w:rFonts w:ascii="Calibri" w:hAnsi="Calibri" w:cs="Calibri" w:asciiTheme="majorHAnsi" w:cstheme="majorHAnsi" w:hAnsiTheme="majorHAnsi"/>
+                <w:sz w:val="22"/>
+                <w:szCs w:val="22"/>
               </w:rPr>
             </w:pPr>
             <w:r>
               <w:rPr>
                 <w:rFonts w:cs="Calibri" w:cstheme="majorHAnsi" w:ascii="Calibri" w:hAnsi="Calibri"/>
+                <w:sz w:val="22"/>
+                <w:szCs w:val="22"/>
               </w:rPr>
             </w:r>
           </w:p>
         </w:tc>
         <w:tc>
           <w:tcPr>
-            <w:tcW w:w="1842" w:type="dxa"/>
+            <w:tcW w:w="3236" w:type="dxa"/>
             <w:tcBorders/>
           </w:tcPr>
           <w:p>
@@ -7655,14 +7672,107 @@
             </w:pPr>
             <w:r>
               <w:rPr>
-                <w:rFonts w:cs="Calibri" w:cstheme="majorHAnsi" w:ascii="Calibri" w:hAnsi="Calibri"/>
-              </w:rPr>
+                <w:rStyle w:val="SourceText"/>
+                <w:rFonts w:asciiTheme="majorHAnsi" w:cstheme="majorHAnsi" w:hAnsiTheme="majorHAnsi" w:ascii="var monaco-monospace-font" w:hAnsi="var monaco-monospace-font"/>
+                <w:b w:val="false"/>
+                <w:i w:val="false"/>
+                <w:caps w:val="false"/>
+                <w:smallCaps w:val="false"/>
+                <w:spacing w:val="0"/>
+                <w:sz w:val="22"/>
+                <w:szCs w:val="22"/>
+              </w:rPr>
+              <w:t>String text</w:t>
+            </w:r>
+            <w:r>
+              <w:rPr>
+                <w:rFonts w:cs="Calibri" w:cstheme="majorHAnsi" w:ascii="system-ui;Ubuntu;Droid Sans;sans-serif" w:hAnsi="system-ui;Ubuntu;Droid Sans;sans-serif"/>
+                <w:b w:val="false"/>
+                <w:i w:val="false"/>
+                <w:caps w:val="false"/>
+                <w:smallCaps w:val="false"/>
+                <w:color w:val="CCCCCC"/>
+                <w:spacing w:val="0"/>
+                <w:sz w:val="22"/>
+                <w:szCs w:val="22"/>
+              </w:rPr>
+              <w:t>,</w:t>
+            </w:r>
+            <w:r>
+              <w:rPr>
+                <w:rStyle w:val="SourceText"/>
+                <w:rFonts w:asciiTheme="majorHAnsi" w:cstheme="majorHAnsi" w:hAnsiTheme="majorHAnsi" w:ascii="var monaco-monospace-font" w:hAnsi="var monaco-monospace-font"/>
+                <w:b w:val="false"/>
+                <w:i w:val="false"/>
+                <w:caps w:val="false"/>
+                <w:smallCaps w:val="false"/>
+                <w:spacing w:val="0"/>
+                <w:sz w:val="22"/>
+                <w:szCs w:val="22"/>
+              </w:rPr>
+              <w:t>bool isPrimary</w:t>
+            </w:r>
+            <w:r>
+              <w:rPr>
+                <w:rFonts w:cs="Calibri" w:cstheme="majorHAnsi" w:ascii="system-ui;Ubuntu;Droid Sans;sans-serif" w:hAnsi="system-ui;Ubuntu;Droid Sans;sans-serif"/>
+                <w:b w:val="false"/>
+                <w:i w:val="false"/>
+                <w:caps w:val="false"/>
+                <w:smallCaps w:val="false"/>
+                <w:color w:val="CCCCCC"/>
+                <w:spacing w:val="0"/>
+                <w:sz w:val="22"/>
+                <w:szCs w:val="22"/>
+              </w:rPr>
+              <w:t>,</w:t>
+            </w:r>
+            <w:r>
+              <w:rPr>
+                <w:rStyle w:val="SourceText"/>
+                <w:rFonts w:asciiTheme="majorHAnsi" w:cstheme="majorHAnsi" w:hAnsiTheme="majorHAnsi" w:ascii="var monaco-monospace-font" w:hAnsi="var monaco-monospace-font"/>
+                <w:b w:val="false"/>
+                <w:i w:val="false"/>
+                <w:caps w:val="false"/>
+                <w:smallCaps w:val="false"/>
+                <w:spacing w:val="0"/>
+                <w:sz w:val="22"/>
+                <w:szCs w:val="22"/>
+              </w:rPr>
+              <w:t>IconData? icon</w:t>
+            </w:r>
+            <w:r>
+              <w:rPr>
+                <w:rFonts w:cs="Calibri" w:cstheme="majorHAnsi" w:ascii="system-ui;Ubuntu;Droid Sans;sans-serif" w:hAnsi="system-ui;Ubuntu;Droid Sans;sans-serif"/>
+                <w:b w:val="false"/>
+                <w:i w:val="false"/>
+                <w:caps w:val="false"/>
+                <w:smallCaps w:val="false"/>
+                <w:color w:val="CCCCCC"/>
+                <w:spacing w:val="0"/>
+                <w:sz w:val="22"/>
+                <w:szCs w:val="22"/>
+              </w:rPr>
+              <w:t>,</w:t>
+            </w:r>
+            <w:r>
+              <w:rPr>
+                <w:rStyle w:val="SourceText"/>
+                <w:rFonts w:asciiTheme="majorHAnsi" w:cstheme="majorHAnsi" w:hAnsiTheme="majorHAnsi" w:ascii="var monaco-monospace-font" w:hAnsi="var monaco-monospace-font"/>
+                <w:b w:val="false"/>
+                <w:i w:val="false"/>
+                <w:caps w:val="false"/>
+                <w:smallCaps w:val="false"/>
+                <w:spacing w:val="0"/>
+                <w:sz w:val="22"/>
+                <w:szCs w:val="22"/>
+              </w:rPr>
+              <w:t>VoidCallback onPressed</w:t>
             </w:r>
           </w:p>
         </w:tc>
         <w:tc>
           <w:tcPr>
-            <w:tcW w:w="1984" w:type="dxa"/>
+            <w:tcW w:w="1699" w:type="dxa"/>
             <w:tcBorders/>
           </w:tcPr>
           <w:p>
@@ -7670,13 +7780,30 @@
               <w:pStyle w:val="Normal"/>
               <w:spacing w:lineRule="auto" w:line="240"/>
               <w:rPr>
-                <w:rFonts w:ascii="Calibri" w:hAnsi="Calibri" w:cs="Calibri" w:asciiTheme="majorHAnsi" w:cstheme="majorHAnsi" w:hAnsiTheme="majorHAnsi"/>
+                <w:rFonts w:ascii="Ubuntu Mono;Liberation Mono;DejaVu Sans Mono;Courier New;monospace" w:hAnsi="Ubuntu Mono;Liberation Mono;DejaVu Sans Mono;Courier New;monospace" w:cs="Calibri" w:cstheme="majorHAnsi"/>
+                <w:b w:val="false"/>
+                <w:i w:val="false"/>
+                <w:caps w:val="false"/>
+                <w:smallCaps w:val="false"/>
+                <w:color w:val="D7BA7D"/>
+                <w:spacing w:val="0"/>
+                <w:sz w:val="22"/>
+                <w:szCs w:val="22"/>
               </w:rPr>
             </w:pPr>
             <w:r>
               <w:rPr>
-                <w:rFonts w:cs="Calibri" w:cstheme="majorHAnsi" w:ascii="Calibri" w:hAnsi="Calibri"/>
-              </w:rPr>
+                <w:rFonts w:cs="Calibri" w:cstheme="majorHAnsi" w:ascii="Ubuntu Mono;Liberation Mono;DejaVu Sans Mono;Courier New;monospace" w:hAnsi="Ubuntu Mono;Liberation Mono;DejaVu Sans Mono;Courier New;monospace"/>
+                <w:b w:val="false"/>
+                <w:i w:val="false"/>
+                <w:caps w:val="false"/>
+                <w:smallCaps w:val="false"/>
+                <w:color w:val="D7BA7D"/>
+                <w:spacing w:val="0"/>
+                <w:sz w:val="22"/>
+                <w:szCs w:val="22"/>
+              </w:rPr>
+              <w:t>onPressed</w:t>
             </w:r>
           </w:p>
         </w:tc>
@@ -8363,11 +8490,29 @@
           <w:bottom w:val="single" w:sz="4" w:space="1" w:color="000000"/>
           <w:right w:val="single" w:sz="4" w:space="4" w:color="000000"/>
         </w:pBdr>
-        <w:jc w:val="center"/>
+        <w:jc w:val="left"/>
         <w:rPr/>
       </w:pPr>
       <w:r>
         <w:rPr/>
+        <w:t>Parameters: RidePref? initRidePref (optional): Initial ride preference to pre-fill the form fields.</w:t>
+      </w:r>
+    </w:p>
+    <w:p>
+      <w:pPr>
+        <w:pStyle w:val="Normal"/>
+        <w:pBdr>
+          <w:top w:val="single" w:sz="4" w:space="1" w:color="000000"/>
+          <w:left w:val="single" w:sz="4" w:space="4" w:color="000000"/>
+          <w:bottom w:val="single" w:sz="4" w:space="1" w:color="000000"/>
+          <w:right w:val="single" w:sz="4" w:space="4" w:color="000000"/>
+        </w:pBdr>
+        <w:jc w:val="left"/>
+        <w:rPr/>
+      </w:pPr>
+      <w:r>
+        <w:rPr/>
+        <w:t>Default Values: initRidePref: null</w:t>
       </w:r>
     </w:p>
     <w:p>
@@ -8421,6 +8566,95 @@
       </w:pPr>
       <w:r>
         <w:rPr/>
+        <w:t>The Search button should be enabled only when all required fields are filled. The required fields are:</w:t>
+      </w:r>
+    </w:p>
+    <w:p>
+      <w:pPr>
+        <w:pStyle w:val="Normal"/>
+        <w:pBdr>
+          <w:top w:val="single" w:sz="4" w:space="1" w:color="000000"/>
+          <w:left w:val="single" w:sz="4" w:space="4" w:color="000000"/>
+          <w:bottom w:val="single" w:sz="4" w:space="1" w:color="000000"/>
+          <w:right w:val="single" w:sz="4" w:space="4" w:color="000000"/>
+        </w:pBdr>
+        <w:rPr/>
+      </w:pPr>
+      <w:r>
+        <w:rPr/>
+        <w:tab/>
+        <w:t>- Departure location</w:t>
+      </w:r>
+    </w:p>
+    <w:p>
+      <w:pPr>
+        <w:pStyle w:val="Normal"/>
+        <w:pBdr>
+          <w:top w:val="single" w:sz="4" w:space="1" w:color="000000"/>
+          <w:left w:val="single" w:sz="4" w:space="4" w:color="000000"/>
+          <w:bottom w:val="single" w:sz="4" w:space="1" w:color="000000"/>
+          <w:right w:val="single" w:sz="4" w:space="4" w:color="000000"/>
+        </w:pBdr>
+        <w:rPr/>
+      </w:pPr>
+      <w:r>
+        <w:rPr/>
+        <w:tab/>
+        <w:t>- Arrival location</w:t>
+      </w:r>
+    </w:p>
+    <w:p>
+      <w:pPr>
+        <w:pStyle w:val="Normal"/>
+        <w:pBdr>
+          <w:top w:val="single" w:sz="4" w:space="1" w:color="000000"/>
+          <w:left w:val="single" w:sz="4" w:space="4" w:color="000000"/>
+          <w:bottom w:val="single" w:sz="4" w:space="1" w:color="000000"/>
+          <w:right w:val="single" w:sz="4" w:space="4" w:color="000000"/>
+        </w:pBdr>
+        <w:rPr/>
+      </w:pPr>
+      <w:r>
+        <w:rPr/>
+        <w:tab/>
+        <w:t>- Departure date</w:t>
+      </w:r>
+    </w:p>
+    <w:p>
+      <w:pPr>
+        <w:pStyle w:val="Normal"/>
+        <w:pBdr>
+          <w:top w:val="single" w:sz="4" w:space="1" w:color="000000"/>
+          <w:left w:val="single" w:sz="4" w:space="4" w:color="000000"/>
+          <w:bottom w:val="single" w:sz="4" w:space="1" w:color="000000"/>
+          <w:right w:val="single" w:sz="4" w:space="4" w:color="000000"/>
+        </w:pBdr>
+        <w:rPr/>
+      </w:pPr>
+      <w:r>
+        <w:rPr/>
+        <w:t xml:space="preserve"> </w:t>
+      </w:r>
+      <w:r>
+        <w:rPr/>
+        <w:tab/>
+        <w:t>- Number of requested seats</w:t>
+      </w:r>
+    </w:p>
+    <w:p>
+      <w:pPr>
+        <w:pStyle w:val="Normal"/>
+        <w:pBdr>
+          <w:top w:val="single" w:sz="4" w:space="1" w:color="000000"/>
+          <w:left w:val="single" w:sz="4" w:space="4" w:color="000000"/>
+          <w:bottom w:val="single" w:sz="4" w:space="1" w:color="000000"/>
+          <w:right w:val="single" w:sz="4" w:space="4" w:color="000000"/>
+        </w:pBdr>
+        <w:rPr/>
+      </w:pPr>
+      <w:r>
+        <w:rPr/>
+        <w:t>Data Popped if Valid: If the form is valid, a RidePref object is created and popped.</w:t>
       </w:r>
     </w:p>
     <w:p>
@@ -8642,14 +8876,16 @@
               <w:pStyle w:val="Normal"/>
               <w:spacing w:lineRule="auto" w:line="240"/>
               <w:rPr>
-                <w:rFonts w:ascii="Calibri" w:hAnsi="Calibri" w:cs="Calibri" w:asciiTheme="majorAscii" w:cstheme="majorAscii" w:hAnsiTheme="majorAscii"/>
-                <w:lang w:val="en-US"/>
+                <w:sz w:val="22"/>
+                <w:szCs w:val="22"/>
               </w:rPr>
             </w:pPr>
             <w:r>
               <w:rPr>
                 <w:rFonts w:cs="Calibri" w:ascii="Calibri" w:hAnsi="Calibri" w:asciiTheme="majorAscii" w:cstheme="majorAscii" w:hAnsiTheme="majorAscii"/>
                 <w:color w:val="FF0000"/>
+                <w:sz w:val="22"/>
+                <w:szCs w:val="22"/>
                 <w:lang w:val="en-US"/>
               </w:rPr>
               <w:t>BlaButton</w:t>
@@ -8666,14 +8902,16 @@
               <w:pStyle w:val="Normal"/>
               <w:spacing w:lineRule="auto" w:line="240"/>
               <w:rPr>
-                <w:rFonts w:ascii="Calibri" w:hAnsi="Calibri" w:cs="Calibri" w:asciiTheme="majorHAnsi" w:cstheme="majorHAnsi" w:hAnsiTheme="majorHAnsi"/>
-                <w:color w:val="FF0000"/>
+                <w:sz w:val="22"/>
+                <w:szCs w:val="22"/>
               </w:rPr>
             </w:pPr>
             <w:r>
               <w:rPr>
                 <w:rFonts w:cs="Calibri" w:ascii="Calibri" w:hAnsi="Calibri" w:asciiTheme="majorHAnsi" w:cstheme="majorHAnsi" w:hAnsiTheme="majorHAnsi"/>
                 <w:color w:val="FF0000"/>
+                <w:sz w:val="22"/>
+                <w:szCs w:val="22"/>
               </w:rPr>
               <w:t>App Widget</w:t>
             </w:r>
@@ -8690,12 +8928,17 @@
               <w:spacing w:lineRule="auto" w:line="240"/>
               <w:rPr>
                 <w:rFonts w:ascii="Calibri" w:hAnsi="Calibri" w:cs="Calibri" w:asciiTheme="majorHAnsi" w:cstheme="majorHAnsi" w:hAnsiTheme="majorHAnsi"/>
+                <w:sz w:val="22"/>
+                <w:szCs w:val="22"/>
               </w:rPr>
             </w:pPr>
             <w:r>
               <w:rPr>
                 <w:rFonts w:cs="Calibri" w:cstheme="majorHAnsi" w:ascii="Calibri" w:hAnsi="Calibri"/>
-              </w:rPr>
+                <w:sz w:val="22"/>
+                <w:szCs w:val="22"/>
+              </w:rPr>
+              <w:t>text, onPressed</w:t>
             </w:r>
           </w:p>
         </w:tc>
@@ -8709,13 +8952,30 @@
               <w:pStyle w:val="Normal"/>
               <w:spacing w:lineRule="auto" w:line="240"/>
               <w:rPr>
-                <w:rFonts w:ascii="Calibri" w:hAnsi="Calibri" w:cs="Calibri" w:asciiTheme="majorHAnsi" w:cstheme="majorHAnsi" w:hAnsiTheme="majorHAnsi"/>
+                <w:rFonts w:ascii="Ubuntu Mono;Liberation Mono;DejaVu Sans Mono;Courier New;monospace" w:hAnsi="Ubuntu Mono;Liberation Mono;DejaVu Sans Mono;Courier New;monospace" w:cs="Calibri" w:cstheme="majorHAnsi"/>
+                <w:b w:val="false"/>
+                <w:i w:val="false"/>
+                <w:caps w:val="false"/>
+                <w:smallCaps w:val="false"/>
+                <w:color w:val="D7BA7D"/>
+                <w:spacing w:val="0"/>
+                <w:sz w:val="22"/>
+                <w:szCs w:val="22"/>
               </w:rPr>
             </w:pPr>
             <w:r>
               <w:rPr>
-                <w:rFonts w:cs="Calibri" w:cstheme="majorHAnsi" w:ascii="Calibri" w:hAnsi="Calibri"/>
-              </w:rPr>
+                <w:rFonts w:cs="Calibri" w:cstheme="majorHAnsi" w:ascii="Ubuntu Mono;Liberation Mono;DejaVu Sans Mono;Courier New;monospace" w:hAnsi="Ubuntu Mono;Liberation Mono;DejaVu Sans Mono;Courier New;monospace"/>
+                <w:b w:val="false"/>
+                <w:i w:val="false"/>
+                <w:caps w:val="false"/>
+                <w:smallCaps w:val="false"/>
+                <w:color w:val="D7BA7D"/>
+                <w:spacing w:val="0"/>
+                <w:sz w:val="22"/>
+                <w:szCs w:val="22"/>
+              </w:rPr>
+              <w:t>onPressed</w:t>
             </w:r>
           </w:p>
         </w:tc>
@@ -8734,13 +8994,30 @@
               <w:pStyle w:val="Normal"/>
               <w:spacing w:lineRule="auto" w:line="240"/>
               <w:rPr>
-                <w:rFonts w:ascii="Calibri" w:hAnsi="Calibri" w:cs="Calibri" w:asciiTheme="majorHAnsi" w:cstheme="majorHAnsi" w:hAnsiTheme="majorHAnsi"/>
+                <w:rFonts w:ascii="Ubuntu Mono;Liberation Mono;DejaVu Sans Mono;Courier New;monospace" w:hAnsi="Ubuntu Mono;Liberation Mono;DejaVu Sans Mono;Courier New;monospace" w:cs="Calibri" w:cstheme="majorHAnsi"/>
+                <w:b w:val="false"/>
+                <w:i w:val="false"/>
+                <w:caps w:val="false"/>
+                <w:smallCaps w:val="false"/>
+                <w:color w:val="D7BA7D"/>
+                <w:spacing w:val="0"/>
+                <w:sz w:val="22"/>
+                <w:szCs w:val="22"/>
               </w:rPr>
             </w:pPr>
             <w:r>
               <w:rPr>
-                <w:rFonts w:cs="Calibri" w:cstheme="majorHAnsi" w:ascii="Calibri" w:hAnsi="Calibri"/>
-              </w:rPr>
+                <w:rFonts w:cs="Calibri" w:cstheme="majorHAnsi" w:ascii="Ubuntu Mono;Liberation Mono;DejaVu Sans Mono;Courier New;monospace" w:hAnsi="Ubuntu Mono;Liberation Mono;DejaVu Sans Mono;Courier New;monospace"/>
+                <w:b w:val="false"/>
+                <w:i w:val="false"/>
+                <w:caps w:val="false"/>
+                <w:smallCaps w:val="false"/>
+                <w:color w:val="D7BA7D"/>
+                <w:spacing w:val="0"/>
+                <w:sz w:val="22"/>
+                <w:szCs w:val="22"/>
+              </w:rPr>
+              <w:t>DropDownMenu</w:t>
             </w:r>
           </w:p>
         </w:tc>
@@ -8756,13 +9033,18 @@
               <w:rPr>
                 <w:rFonts w:ascii="Calibri" w:hAnsi="Calibri" w:cs="Calibri" w:asciiTheme="majorHAnsi" w:cstheme="majorHAnsi" w:hAnsiTheme="majorHAnsi"/>
                 <w:color w:val="FF0000"/>
+                <w:sz w:val="22"/>
+                <w:szCs w:val="22"/>
               </w:rPr>
             </w:pPr>
             <w:r>
               <w:rPr>
-                <w:rFonts w:cs="Calibri" w:cstheme="majorHAnsi" w:ascii="Calibri" w:hAnsi="Calibri"/>
+                <w:rFonts w:cs="Calibri" w:ascii="Calibri" w:hAnsi="Calibri" w:asciiTheme="majorHAnsi" w:cstheme="majorHAnsi" w:hAnsiTheme="majorHAnsi"/>
                 <w:color w:val="FF0000"/>
-              </w:rPr>
+                <w:sz w:val="22"/>
+                <w:szCs w:val="22"/>
+              </w:rPr>
+              <w:t>Screen Widget</w:t>
             </w:r>
           </w:p>
         </w:tc>
@@ -8781,8 +9063,18 @@
             </w:pPr>
             <w:r>
               <w:rPr>
-                <w:rFonts w:cs="Calibri" w:cstheme="majorHAnsi" w:ascii="Calibri" w:hAnsi="Calibri"/>
-              </w:rPr>
+                <w:rStyle w:val="SourceText"/>
+                <w:rFonts w:asciiTheme="majorHAnsi" w:cstheme="majorHAnsi" w:hAnsiTheme="majorHAnsi" w:ascii="Ubuntu Mono;Liberation Mono;DejaVu Sans Mono;Courier New;monospace" w:hAnsi="Ubuntu Mono;Liberation Mono;DejaVu Sans Mono;Courier New;monospace"/>
+                <w:b w:val="false"/>
+                <w:i w:val="false"/>
+                <w:caps w:val="false"/>
+                <w:smallCaps w:val="false"/>
+                <w:color w:val="D7BA7D"/>
+                <w:spacing w:val="0"/>
+                <w:sz w:val="22"/>
+                <w:szCs w:val="22"/>
+              </w:rPr>
+              <w:t>hint, value, items, onChanged, icon</w:t>
             </w:r>
           </w:p>
         </w:tc>
@@ -8796,13 +9088,30 @@
               <w:pStyle w:val="Normal"/>
               <w:spacing w:lineRule="auto" w:line="240"/>
               <w:rPr>
-                <w:rFonts w:ascii="Calibri" w:hAnsi="Calibri" w:cs="Calibri" w:asciiTheme="majorHAnsi" w:cstheme="majorHAnsi" w:hAnsiTheme="majorHAnsi"/>
+                <w:rFonts w:ascii="Ubuntu Mono;Liberation Mono;DejaVu Sans Mono;Courier New;monospace" w:hAnsi="Ubuntu Mono;Liberation Mono;DejaVu Sans Mono;Courier New;monospace" w:cs="Calibri" w:cstheme="majorHAnsi"/>
+                <w:b w:val="false"/>
+                <w:i w:val="false"/>
+                <w:caps w:val="false"/>
+                <w:smallCaps w:val="false"/>
+                <w:color w:val="D7BA7D"/>
+                <w:spacing w:val="0"/>
+                <w:sz w:val="22"/>
+                <w:szCs w:val="22"/>
               </w:rPr>
             </w:pPr>
             <w:r>
               <w:rPr>
-                <w:rFonts w:cs="Calibri" w:cstheme="majorHAnsi" w:ascii="Calibri" w:hAnsi="Calibri"/>
-              </w:rPr>
+                <w:rFonts w:cs="Calibri" w:cstheme="majorHAnsi" w:ascii="Ubuntu Mono;Liberation Mono;DejaVu Sans Mono;Courier New;monospace" w:hAnsi="Ubuntu Mono;Liberation Mono;DejaVu Sans Mono;Courier New;monospace"/>
+                <w:b w:val="false"/>
+                <w:i w:val="false"/>
+                <w:caps w:val="false"/>
+                <w:smallCaps w:val="false"/>
+                <w:color w:val="D7BA7D"/>
+                <w:spacing w:val="0"/>
+                <w:sz w:val="22"/>
+                <w:szCs w:val="22"/>
+              </w:rPr>
+              <w:t>onChanged</w:t>
             </w:r>
           </w:p>
         </w:tc>
@@ -8822,12 +9131,17 @@
               <w:spacing w:lineRule="auto" w:line="240"/>
               <w:rPr>
                 <w:rFonts w:ascii="Calibri" w:hAnsi="Calibri" w:cs="Calibri" w:asciiTheme="majorHAnsi" w:cstheme="majorHAnsi" w:hAnsiTheme="majorHAnsi"/>
+                <w:sz w:val="22"/>
+                <w:szCs w:val="22"/>
               </w:rPr>
             </w:pPr>
             <w:r>
               <w:rPr>
                 <w:rFonts w:cs="Calibri" w:cstheme="majorHAnsi" w:ascii="Calibri" w:hAnsi="Calibri"/>
-              </w:rPr>
+                <w:sz w:val="22"/>
+                <w:szCs w:val="22"/>
+              </w:rPr>
+              <w:t>showDatePicker</w:t>
             </w:r>
           </w:p>
         </w:tc>
@@ -8843,13 +9157,18 @@
               <w:rPr>
                 <w:rFonts w:ascii="Calibri" w:hAnsi="Calibri" w:cs="Calibri" w:asciiTheme="majorHAnsi" w:cstheme="majorHAnsi" w:hAnsiTheme="majorHAnsi"/>
                 <w:color w:val="FF0000"/>
+                <w:sz w:val="22"/>
+                <w:szCs w:val="22"/>
               </w:rPr>
             </w:pPr>
             <w:r>
               <w:rPr>
                 <w:rFonts w:cs="Calibri" w:cstheme="majorHAnsi" w:ascii="Calibri" w:hAnsi="Calibri"/>
                 <w:color w:val="FF0000"/>
-              </w:rPr>
+                <w:sz w:val="22"/>
+                <w:szCs w:val="22"/>
+              </w:rPr>
+              <w:t>Screen Widget</w:t>
             </w:r>
           </w:p>
         </w:tc>
@@ -8864,12 +9183,37 @@
               <w:spacing w:lineRule="auto" w:line="240"/>
               <w:rPr>
                 <w:rFonts w:ascii="Calibri" w:hAnsi="Calibri" w:cs="Calibri" w:asciiTheme="majorHAnsi" w:cstheme="majorHAnsi" w:hAnsiTheme="majorHAnsi"/>
+                <w:sz w:val="22"/>
+                <w:szCs w:val="22"/>
               </w:rPr>
             </w:pPr>
             <w:r>
               <w:rPr>
                 <w:rFonts w:cs="Calibri" w:cstheme="majorHAnsi" w:ascii="Calibri" w:hAnsi="Calibri"/>
-              </w:rPr>
+                <w:sz w:val="22"/>
+                <w:szCs w:val="22"/>
+              </w:rPr>
+              <w:t xml:space="preserve">InitialDate, </w:t>
+            </w:r>
+            <w:r>
+              <w:rPr>
+                <w:rFonts w:cs="Calibri" w:cstheme="majorHAnsi" w:ascii="Droid Sans Mono;monospace;monospace" w:hAnsi="Droid Sans Mono;monospace;monospace"/>
+                <w:b w:val="false"/>
+                <w:color w:val="000000"/>
+                <w:sz w:val="22"/>
+                <w:szCs w:val="22"/>
+              </w:rPr>
+              <w:t xml:space="preserve">firstDate, </w:t>
+            </w:r>
+            <w:r>
+              <w:rPr>
+                <w:rFonts w:cs="Calibri" w:cstheme="majorHAnsi" w:ascii="Droid Sans Mono;monospace;monospace" w:hAnsi="Droid Sans Mono;monospace;monospace"/>
+                <w:b w:val="false"/>
+                <w:color w:val="000000"/>
+                <w:sz w:val="22"/>
+                <w:szCs w:val="22"/>
+              </w:rPr>
+              <w:t>lastDate</w:t>
             </w:r>
           </w:p>
         </w:tc>
@@ -8884,12 +9228,25 @@
               <w:spacing w:lineRule="auto" w:line="240"/>
               <w:rPr>
                 <w:rFonts w:ascii="Calibri" w:hAnsi="Calibri" w:cs="Calibri" w:asciiTheme="majorHAnsi" w:cstheme="majorHAnsi" w:hAnsiTheme="majorHAnsi"/>
+                <w:sz w:val="22"/>
+                <w:szCs w:val="22"/>
               </w:rPr>
             </w:pPr>
             <w:r>
               <w:rPr>
                 <w:rFonts w:cs="Calibri" w:cstheme="majorHAnsi" w:ascii="Calibri" w:hAnsi="Calibri"/>
-              </w:rPr>
+                <w:sz w:val="22"/>
+                <w:szCs w:val="22"/>
+              </w:rPr>
+              <w:t xml:space="preserve"> </w:t>
+            </w:r>
+            <w:r>
+              <w:rPr>
+                <w:rFonts w:cs="Calibri" w:cstheme="majorHAnsi" w:ascii="Calibri" w:hAnsi="Calibri"/>
+                <w:sz w:val="22"/>
+                <w:szCs w:val="22"/>
+              </w:rPr>
+              <w:t>None</w:t>
             </w:r>
           </w:p>
         </w:tc>
@@ -9116,6 +9473,42 @@
           <w:rFonts w:cs="Calibri" w:ascii="Calibri" w:hAnsi="Calibri" w:asciiTheme="majorHAnsi" w:cstheme="majorHAnsi" w:hAnsiTheme="majorHAnsi"/>
         </w:rPr>
         <w:t xml:space="preserve"> () in a clean way?</w:t>
+      </w:r>
+    </w:p>
+    <w:p>
+      <w:pPr>
+        <w:pStyle w:val="Normal"/>
+        <w:rPr>
+          <w:rFonts w:ascii="Calibri" w:hAnsi="Calibri" w:cs="Calibri" w:asciiTheme="majorHAnsi" w:cstheme="majorHAnsi" w:hAnsiTheme="majorHAnsi"/>
+        </w:rPr>
+      </w:pPr>
+      <w:r>
+        <w:rPr/>
+        <w:t>Create a Method: Define a method called switchLocations that swaps the values of the departure and arrival variables.</w:t>
+      </w:r>
+    </w:p>
+    <w:p>
+      <w:pPr>
+        <w:pStyle w:val="Normal"/>
+        <w:rPr>
+          <w:rFonts w:ascii="Calibri" w:hAnsi="Calibri" w:cs="Calibri" w:asciiTheme="majorHAnsi" w:cstheme="majorHAnsi" w:hAnsiTheme="majorHAnsi"/>
+        </w:rPr>
+      </w:pPr>
+      <w:r>
+        <w:rPr/>
+        <w:t>Update State: Use the setState method within switchLocations to update the state and trigger a UI refresh.</w:t>
+      </w:r>
+    </w:p>
+    <w:p>
+      <w:pPr>
+        <w:pStyle w:val="Normal"/>
+        <w:rPr>
+          <w:rFonts w:ascii="Calibri" w:hAnsi="Calibri" w:cs="Calibri" w:asciiTheme="majorHAnsi" w:cstheme="majorHAnsi" w:hAnsiTheme="majorHAnsi"/>
+        </w:rPr>
+      </w:pPr>
+      <w:r>
+        <w:rPr/>
+        <w:t>Attach to UI: Attach the switchLocations method to an IconButton in the UI, placing it next to the DropdownButton for the departure location.</w:t>
       </w:r>
     </w:p>
     <w:p>
@@ -14370,6 +14763,11 @@
       <w:b/>
       <w:bCs/>
     </w:rPr>
+  </w:style>
+  <w:style w:type="character" w:styleId="NumberingSymbols">
+    <w:name w:val="Numbering Symbols"/>
+    <w:qFormat/>
+    <w:rPr/>
   </w:style>
   <w:style w:type="paragraph" w:styleId="Heading">
     <w:name w:val="Heading"/>

</xml_diff>

<commit_message>
BLA-005 – Implement the Location Picker
</commit_message>
<xml_diff>
--- a/W3-BlaBla-Project-Part1/W3 - PRACTICE -  Generic & Screen Widgets.docx
+++ b/W3-BlaBla-Project-Part1/W3 - PRACTICE -  Generic & Screen Widgets.docx
@@ -9821,6 +9821,73 @@
         <w:rPr>
           <w:rFonts w:cs="Calibri" w:cstheme="majorHAnsi" w:ascii="Calibri" w:hAnsi="Calibri"/>
         </w:rPr>
+        <w:t>Actions:</w:t>
+      </w:r>
+    </w:p>
+    <w:p>
+      <w:pPr>
+        <w:pStyle w:val="Normal"/>
+        <w:pBdr>
+          <w:top w:val="single" w:sz="4" w:space="1" w:color="000000"/>
+          <w:left w:val="single" w:sz="4" w:space="4" w:color="000000"/>
+          <w:bottom w:val="single" w:sz="4" w:space="1" w:color="000000"/>
+          <w:right w:val="single" w:sz="4" w:space="4" w:color="000000"/>
+        </w:pBdr>
+        <w:ind w:left="360" w:hanging="0"/>
+        <w:rPr>
+          <w:rFonts w:ascii="Calibri" w:hAnsi="Calibri" w:cs="Calibri" w:asciiTheme="majorHAnsi" w:cstheme="majorHAnsi" w:hAnsiTheme="majorHAnsi"/>
+        </w:rPr>
+      </w:pPr>
+      <w:r>
+        <w:rPr>
+          <w:rFonts w:cs="Calibri" w:cstheme="majorHAnsi" w:ascii="Calibri" w:hAnsi="Calibri"/>
+        </w:rPr>
+        <w:tab/>
+        <w:t>- Typing in the search bar to filter locations.</w:t>
+      </w:r>
+    </w:p>
+    <w:p>
+      <w:pPr>
+        <w:pStyle w:val="Normal"/>
+        <w:pBdr>
+          <w:top w:val="single" w:sz="4" w:space="1" w:color="000000"/>
+          <w:left w:val="single" w:sz="4" w:space="4" w:color="000000"/>
+          <w:bottom w:val="single" w:sz="4" w:space="1" w:color="000000"/>
+          <w:right w:val="single" w:sz="4" w:space="4" w:color="000000"/>
+        </w:pBdr>
+        <w:ind w:left="360" w:hanging="0"/>
+        <w:rPr>
+          <w:rFonts w:ascii="Calibri" w:hAnsi="Calibri" w:cs="Calibri" w:asciiTheme="majorHAnsi" w:cstheme="majorHAnsi" w:hAnsiTheme="majorHAnsi"/>
+        </w:rPr>
+      </w:pPr>
+      <w:r>
+        <w:rPr>
+          <w:rFonts w:cs="Calibri" w:cstheme="majorHAnsi" w:ascii="Calibri" w:hAnsi="Calibri"/>
+        </w:rPr>
+        <w:tab/>
+        <w:t>- Selecting a location from the filtered list.</w:t>
+      </w:r>
+    </w:p>
+    <w:p>
+      <w:pPr>
+        <w:pStyle w:val="Normal"/>
+        <w:pBdr>
+          <w:top w:val="single" w:sz="4" w:space="1" w:color="000000"/>
+          <w:left w:val="single" w:sz="4" w:space="4" w:color="000000"/>
+          <w:bottom w:val="single" w:sz="4" w:space="1" w:color="000000"/>
+          <w:right w:val="single" w:sz="4" w:space="4" w:color="000000"/>
+        </w:pBdr>
+        <w:ind w:left="360" w:hanging="0"/>
+        <w:rPr>
+          <w:rFonts w:ascii="Calibri" w:hAnsi="Calibri" w:cs="Calibri" w:asciiTheme="majorHAnsi" w:cstheme="majorHAnsi" w:hAnsiTheme="majorHAnsi"/>
+        </w:rPr>
+      </w:pPr>
+      <w:r>
+        <w:rPr>
+          <w:rFonts w:cs="Calibri" w:cstheme="majorHAnsi" w:ascii="Calibri" w:hAnsi="Calibri"/>
+        </w:rPr>
+        <w:tab/>
+        <w:t>- Clearing the search input.</w:t>
       </w:r>
     </w:p>
     <w:p>
@@ -9932,8 +9999,8 @@
       </w:tblPr>
       <w:tblGrid>
         <w:gridCol w:w="1980"/>
-        <w:gridCol w:w="3543"/>
-        <w:gridCol w:w="1842"/>
+        <w:gridCol w:w="2248"/>
+        <w:gridCol w:w="3137"/>
         <w:gridCol w:w="1984"/>
       </w:tblGrid>
       <w:tr>
@@ -9962,7 +10029,7 @@
         </w:tc>
         <w:tc>
           <w:tcPr>
-            <w:tcW w:w="3543" w:type="dxa"/>
+            <w:tcW w:w="2248" w:type="dxa"/>
             <w:tcBorders/>
             <w:shd w:color="auto" w:fill="B8CCE4" w:themeFill="accent1" w:themeFillTint="66" w:val="clear"/>
           </w:tcPr>
@@ -9984,7 +10051,7 @@
         </w:tc>
         <w:tc>
           <w:tcPr>
-            <w:tcW w:w="1842" w:type="dxa"/>
+            <w:tcW w:w="3137" w:type="dxa"/>
             <w:tcBorders/>
             <w:shd w:color="auto" w:fill="B8CCE4" w:themeFill="accent1" w:themeFillTint="66" w:val="clear"/>
           </w:tcPr>
@@ -10046,14 +10113,23 @@
             </w:pPr>
             <w:r>
               <w:rPr>
-                <w:rFonts w:cs="Calibri" w:cstheme="majorHAnsi" w:ascii="Calibri" w:hAnsi="Calibri"/>
-              </w:rPr>
+                <w:rStyle w:val="StrongEmphasis"/>
+                <w:rFonts w:cs="Calibri" w:cstheme="majorHAnsi" w:ascii="system-ui;Ubuntu;Droid Sans;sans-serif" w:hAnsi="system-ui;Ubuntu;Droid Sans;sans-serif"/>
+                <w:b w:val="false"/>
+                <w:i w:val="false"/>
+                <w:caps w:val="false"/>
+                <w:smallCaps w:val="false"/>
+                <w:color w:val="000000"/>
+                <w:spacing w:val="0"/>
+                <w:sz w:val="20"/>
+              </w:rPr>
+              <w:t>TextField</w:t>
             </w:r>
           </w:p>
         </w:tc>
         <w:tc>
           <w:tcPr>
-            <w:tcW w:w="3543" w:type="dxa"/>
+            <w:tcW w:w="2248" w:type="dxa"/>
             <w:tcBorders/>
           </w:tcPr>
           <w:p>
@@ -10062,34 +10138,56 @@
               <w:spacing w:lineRule="auto" w:line="240"/>
               <w:rPr>
                 <w:rFonts w:ascii="Calibri" w:hAnsi="Calibri" w:cs="Calibri" w:asciiTheme="majorHAnsi" w:cstheme="majorHAnsi" w:hAnsiTheme="majorHAnsi"/>
-                <w:color w:val="FF0000"/>
+                <w:color w:val="000000"/>
               </w:rPr>
             </w:pPr>
             <w:r>
               <w:rPr>
-                <w:rFonts w:cs="Calibri" w:cstheme="majorHAnsi" w:ascii="Calibri" w:hAnsi="Calibri"/>
-                <w:color w:val="FF0000"/>
-              </w:rPr>
+                <w:rFonts w:cs="Calibri" w:ascii="Calibri" w:hAnsi="Calibri" w:asciiTheme="majorHAnsi" w:cstheme="majorHAnsi" w:hAnsiTheme="majorHAnsi"/>
+                <w:color w:val="000000"/>
+              </w:rPr>
+              <w:t>Screen Widget</w:t>
             </w:r>
           </w:p>
         </w:tc>
         <w:tc>
           <w:tcPr>
-            <w:tcW w:w="1842" w:type="dxa"/>
+            <w:tcW w:w="3137" w:type="dxa"/>
             <w:tcBorders/>
           </w:tcPr>
           <w:p>
             <w:pPr>
-              <w:pStyle w:val="Normal"/>
-              <w:spacing w:lineRule="auto" w:line="240"/>
-              <w:rPr>
-                <w:rFonts w:ascii="Calibri" w:hAnsi="Calibri" w:cs="Calibri" w:asciiTheme="majorHAnsi" w:cstheme="majorHAnsi" w:hAnsiTheme="majorHAnsi"/>
-              </w:rPr>
+              <w:pStyle w:val="TextBody"/>
+              <w:spacing w:lineRule="auto" w:line="240" w:before="0" w:after="140"/>
+              <w:rPr/>
             </w:pPr>
             <w:r>
               <w:rPr>
-                <w:rFonts w:cs="Calibri" w:cstheme="majorHAnsi" w:ascii="Calibri" w:hAnsi="Calibri"/>
-              </w:rPr>
+                <w:rStyle w:val="SourceText"/>
+                <w:rFonts w:ascii="var monaco-monospace-font" w:hAnsi="var monaco-monospace-font"/>
+                <w:b w:val="false"/>
+                <w:i w:val="false"/>
+                <w:caps w:val="false"/>
+                <w:smallCaps w:val="false"/>
+                <w:color w:val="000000"/>
+                <w:spacing w:val="0"/>
+                <w:sz w:val="18"/>
+              </w:rPr>
+              <w:t xml:space="preserve">Controller, </w:t>
+            </w:r>
+            <w:r>
+              <w:rPr>
+                <w:rStyle w:val="SourceText"/>
+                <w:rFonts w:ascii="var monaco-monospace-font" w:hAnsi="var monaco-monospace-font"/>
+                <w:b w:val="false"/>
+                <w:i w:val="false"/>
+                <w:caps w:val="false"/>
+                <w:smallCaps w:val="false"/>
+                <w:color w:val="000000"/>
+                <w:spacing w:val="0"/>
+                <w:sz w:val="18"/>
+              </w:rPr>
+              <w:t>decoration</w:t>
             </w:r>
           </w:p>
         </w:tc>
@@ -10108,8 +10206,17 @@
             </w:pPr>
             <w:r>
               <w:rPr>
-                <w:rFonts w:cs="Calibri" w:cstheme="majorHAnsi" w:ascii="Calibri" w:hAnsi="Calibri"/>
-              </w:rPr>
+                <w:rStyle w:val="SourceText"/>
+                <w:rFonts w:asciiTheme="majorHAnsi" w:cstheme="majorHAnsi" w:hAnsiTheme="majorHAnsi" w:ascii="var monaco-monospace-font" w:hAnsi="var monaco-monospace-font"/>
+                <w:b w:val="false"/>
+                <w:i w:val="false"/>
+                <w:caps w:val="false"/>
+                <w:smallCaps w:val="false"/>
+                <w:color w:val="000000"/>
+                <w:spacing w:val="0"/>
+                <w:sz w:val="18"/>
+              </w:rPr>
+              <w:t>onChanged</w:t>
             </w:r>
           </w:p>
         </w:tc>
@@ -10133,14 +10240,23 @@
             </w:pPr>
             <w:r>
               <w:rPr>
-                <w:rFonts w:cs="Calibri" w:cstheme="majorHAnsi" w:ascii="Calibri" w:hAnsi="Calibri"/>
-              </w:rPr>
+                <w:rStyle w:val="StrongEmphasis"/>
+                <w:rFonts w:cs="Calibri" w:cstheme="majorHAnsi" w:ascii="system-ui;Ubuntu;Droid Sans;sans-serif" w:hAnsi="system-ui;Ubuntu;Droid Sans;sans-serif"/>
+                <w:b w:val="false"/>
+                <w:i w:val="false"/>
+                <w:caps w:val="false"/>
+                <w:smallCaps w:val="false"/>
+                <w:color w:val="000000"/>
+                <w:spacing w:val="0"/>
+                <w:sz w:val="20"/>
+              </w:rPr>
+              <w:t>ListView.builder</w:t>
             </w:r>
           </w:p>
         </w:tc>
         <w:tc>
           <w:tcPr>
-            <w:tcW w:w="3543" w:type="dxa"/>
+            <w:tcW w:w="2248" w:type="dxa"/>
             <w:tcBorders/>
           </w:tcPr>
           <w:p>
@@ -10149,34 +10265,80 @@
               <w:spacing w:lineRule="auto" w:line="240"/>
               <w:rPr>
                 <w:rFonts w:ascii="Calibri" w:hAnsi="Calibri" w:cs="Calibri" w:asciiTheme="majorHAnsi" w:cstheme="majorHAnsi" w:hAnsiTheme="majorHAnsi"/>
-                <w:color w:val="FF0000"/>
+                <w:color w:val="000000"/>
               </w:rPr>
             </w:pPr>
             <w:r>
               <w:rPr>
-                <w:rFonts w:cs="Calibri" w:cstheme="majorHAnsi" w:ascii="Calibri" w:hAnsi="Calibri"/>
-                <w:color w:val="FF0000"/>
-              </w:rPr>
+                <w:rFonts w:cs="Calibri" w:ascii="Calibri" w:hAnsi="Calibri" w:asciiTheme="majorHAnsi" w:cstheme="majorHAnsi" w:hAnsiTheme="majorHAnsi"/>
+                <w:color w:val="000000"/>
+              </w:rPr>
+              <w:t>Screen Widget</w:t>
             </w:r>
           </w:p>
         </w:tc>
         <w:tc>
           <w:tcPr>
-            <w:tcW w:w="1842" w:type="dxa"/>
+            <w:tcW w:w="3137" w:type="dxa"/>
             <w:tcBorders/>
           </w:tcPr>
           <w:p>
             <w:pPr>
-              <w:pStyle w:val="Normal"/>
-              <w:spacing w:lineRule="auto" w:line="240"/>
-              <w:rPr>
-                <w:rFonts w:ascii="Calibri" w:hAnsi="Calibri" w:cs="Calibri" w:asciiTheme="majorHAnsi" w:cstheme="majorHAnsi" w:hAnsiTheme="majorHAnsi"/>
+              <w:pStyle w:val="TextBody"/>
+              <w:spacing w:lineRule="auto" w:line="240" w:before="0" w:after="140"/>
+              <w:rPr>
+                <w:rStyle w:val="SourceText"/>
+                <w:rFonts w:ascii="var monaco-monospace-font" w:hAnsi="var monaco-monospace-font"/>
+                <w:b w:val="false"/>
+                <w:i w:val="false"/>
+                <w:caps w:val="false"/>
+                <w:smallCaps w:val="false"/>
+                <w:color w:val="000000"/>
+                <w:spacing w:val="0"/>
+                <w:sz w:val="18"/>
               </w:rPr>
             </w:pPr>
             <w:r>
               <w:rPr>
-                <w:rFonts w:cs="Calibri" w:cstheme="majorHAnsi" w:ascii="Calibri" w:hAnsi="Calibri"/>
-              </w:rPr>
+                <w:rStyle w:val="SourceText"/>
+                <w:rFonts w:ascii="Ubuntu Mono;Liberation Mono;DejaVu Sans Mono;Courier New;monospace" w:hAnsi="Ubuntu Mono;Liberation Mono;DejaVu Sans Mono;Courier New;monospace"/>
+                <w:b w:val="false"/>
+                <w:i w:val="false"/>
+                <w:caps w:val="false"/>
+                <w:smallCaps w:val="false"/>
+                <w:color w:val="000000"/>
+                <w:spacing w:val="0"/>
+                <w:sz w:val="18"/>
+              </w:rPr>
+              <w:t>ItemCount</w:t>
+            </w:r>
+            <w:r>
+              <w:rPr>
+                <w:rStyle w:val="SourceText"/>
+                <w:rFonts w:ascii="var monaco-monospace-font" w:hAnsi="var monaco-monospace-font"/>
+                <w:b w:val="false"/>
+                <w:i w:val="false"/>
+                <w:caps w:val="false"/>
+                <w:smallCaps w:val="false"/>
+                <w:color w:val="000000"/>
+                <w:spacing w:val="0"/>
+                <w:sz w:val="18"/>
+              </w:rPr>
+              <w:t xml:space="preserve">, </w:t>
+            </w:r>
+            <w:r>
+              <w:rPr>
+                <w:rStyle w:val="SourceText"/>
+                <w:rFonts w:ascii="Ubuntu Mono;Liberation Mono;DejaVu Sans Mono;Courier New;monospace" w:hAnsi="Ubuntu Mono;Liberation Mono;DejaVu Sans Mono;Courier New;monospace"/>
+                <w:b w:val="false"/>
+                <w:i w:val="false"/>
+                <w:caps w:val="false"/>
+                <w:smallCaps w:val="false"/>
+                <w:color w:val="000000"/>
+                <w:spacing w:val="0"/>
+                <w:sz w:val="18"/>
+              </w:rPr>
+              <w:t>itemBuilder</w:t>
             </w:r>
           </w:p>
         </w:tc>
@@ -10187,16 +10349,25 @@
           </w:tcPr>
           <w:p>
             <w:pPr>
-              <w:pStyle w:val="Normal"/>
-              <w:spacing w:lineRule="auto" w:line="240"/>
+              <w:pStyle w:val="TextBody"/>
+              <w:spacing w:lineRule="auto" w:line="240" w:before="0" w:after="140"/>
               <w:rPr>
                 <w:rFonts w:ascii="Calibri" w:hAnsi="Calibri" w:cs="Calibri" w:asciiTheme="majorHAnsi" w:cstheme="majorHAnsi" w:hAnsiTheme="majorHAnsi"/>
               </w:rPr>
             </w:pPr>
             <w:r>
               <w:rPr>
-                <w:rFonts w:cs="Calibri" w:cstheme="majorHAnsi" w:ascii="Calibri" w:hAnsi="Calibri"/>
-              </w:rPr>
+                <w:rStyle w:val="SourceText"/>
+                <w:rFonts w:asciiTheme="majorHAnsi" w:cstheme="majorHAnsi" w:hAnsiTheme="majorHAnsi" w:ascii="var monaco-monospace-font" w:hAnsi="var monaco-monospace-font"/>
+                <w:b w:val="false"/>
+                <w:i w:val="false"/>
+                <w:caps w:val="false"/>
+                <w:smallCaps w:val="false"/>
+                <w:color w:val="000000"/>
+                <w:spacing w:val="0"/>
+                <w:sz w:val="18"/>
+              </w:rPr>
+              <w:t>onTap</w:t>
             </w:r>
           </w:p>
         </w:tc>
@@ -10227,7 +10398,7 @@
         </w:tc>
         <w:tc>
           <w:tcPr>
-            <w:tcW w:w="3543" w:type="dxa"/>
+            <w:tcW w:w="2248" w:type="dxa"/>
             <w:tcBorders/>
           </w:tcPr>
           <w:p>
@@ -10249,7 +10420,7 @@
         </w:tc>
         <w:tc>
           <w:tcPr>
-            <w:tcW w:w="1842" w:type="dxa"/>
+            <w:tcW w:w="3137" w:type="dxa"/>
             <w:tcBorders/>
           </w:tcPr>
           <w:p>
@@ -10314,7 +10485,7 @@
         </w:tc>
         <w:tc>
           <w:tcPr>
-            <w:tcW w:w="3543" w:type="dxa"/>
+            <w:tcW w:w="2248" w:type="dxa"/>
             <w:tcBorders/>
           </w:tcPr>
           <w:p>
@@ -10336,7 +10507,7 @@
         </w:tc>
         <w:tc>
           <w:tcPr>
-            <w:tcW w:w="1842" w:type="dxa"/>
+            <w:tcW w:w="3137" w:type="dxa"/>
             <w:tcBorders/>
           </w:tcPr>
           <w:p>
@@ -10401,7 +10572,7 @@
         </w:tc>
         <w:tc>
           <w:tcPr>
-            <w:tcW w:w="3543" w:type="dxa"/>
+            <w:tcW w:w="2248" w:type="dxa"/>
             <w:tcBorders/>
           </w:tcPr>
           <w:p>
@@ -10423,7 +10594,7 @@
         </w:tc>
         <w:tc>
           <w:tcPr>
-            <w:tcW w:w="1842" w:type="dxa"/>
+            <w:tcW w:w="3137" w:type="dxa"/>
             <w:tcBorders/>
           </w:tcPr>
           <w:p>

</xml_diff>